<commit_message>
re ran data to get up to date hydrology, qaqc'ed, updated how to
numbers seem to make sense, some changes due to slight revisions in data from gages on the upper C near granby (CR Below Lake Granby Flow gage) which lead to a change in the corrective factor which led to ah
</commit_message>
<xml_diff>
--- a/Reconstructing Hydrology How to.docx
+++ b/Reconstructing Hydrology How to.docx
@@ -1,6 +1,6 @@
 
 <file path=word/document.xml><?xml version="1.0" encoding="utf-8"?>
-<w:document xmlns:wpc="http://schemas.microsoft.com/office/word/2010/wordprocessingCanvas" xmlns:cx="http://schemas.microsoft.com/office/drawing/2014/chartex" xmlns:cx1="http://schemas.microsoft.com/office/drawing/2015/9/8/chartex" xmlns:mc="http://schemas.openxmlformats.org/markup-compatibility/2006" xmlns:o="urn:schemas-microsoft-com:office:office" xmlns:r="http://schemas.openxmlformats.org/officeDocument/2006/relationships" xmlns:m="http://schemas.openxmlformats.org/officeDocument/2006/math" xmlns:v="urn:schemas-microsoft-com:vml" xmlns:wp14="http://schemas.microsoft.com/office/word/2010/wordprocessingDrawing" xmlns:wp="http://schemas.openxmlformats.org/drawingml/2006/wordprocessingDrawing" xmlns:w10="urn:schemas-microsoft-com:office:word" xmlns:w="http://schemas.openxmlformats.org/wordprocessingml/2006/main" xmlns:w14="http://schemas.microsoft.com/office/word/2010/wordml" xmlns:w15="http://schemas.microsoft.com/office/word/2012/wordml" xmlns:w16se="http://schemas.microsoft.com/office/word/2015/wordml/symex" xmlns:wpg="http://schemas.microsoft.com/office/word/2010/wordprocessingGroup" xmlns:wpi="http://schemas.microsoft.com/office/word/2010/wordprocessingInk" xmlns:wne="http://schemas.microsoft.com/office/word/2006/wordml" xmlns:wps="http://schemas.microsoft.com/office/word/2010/wordprocessingShape" mc:Ignorable="w14 w15 w16se wp14">
+<w:document xmlns:wpc="http://schemas.microsoft.com/office/word/2010/wordprocessingCanvas" xmlns:cx="http://schemas.microsoft.com/office/drawing/2014/chartex" xmlns:cx1="http://schemas.microsoft.com/office/drawing/2015/9/8/chartex" xmlns:cx2="http://schemas.microsoft.com/office/drawing/2015/10/21/chartex" xmlns:cx3="http://schemas.microsoft.com/office/drawing/2016/5/9/chartex" xmlns:cx4="http://schemas.microsoft.com/office/drawing/2016/5/10/chartex" xmlns:cx5="http://schemas.microsoft.com/office/drawing/2016/5/11/chartex" xmlns:cx6="http://schemas.microsoft.com/office/drawing/2016/5/12/chartex" xmlns:cx7="http://schemas.microsoft.com/office/drawing/2016/5/13/chartex" xmlns:cx8="http://schemas.microsoft.com/office/drawing/2016/5/14/chartex" xmlns:mc="http://schemas.openxmlformats.org/markup-compatibility/2006" xmlns:aink="http://schemas.microsoft.com/office/drawing/2016/ink" xmlns:am3d="http://schemas.microsoft.com/office/drawing/2017/model3d" xmlns:o="urn:schemas-microsoft-com:office:office" xmlns:oel="http://schemas.microsoft.com/office/2019/extlst" xmlns:r="http://schemas.openxmlformats.org/officeDocument/2006/relationships" xmlns:m="http://schemas.openxmlformats.org/officeDocument/2006/math" xmlns:v="urn:schemas-microsoft-com:vml" xmlns:wp14="http://schemas.microsoft.com/office/word/2010/wordprocessingDrawing" xmlns:wp="http://schemas.openxmlformats.org/drawingml/2006/wordprocessingDrawing" xmlns:w10="urn:schemas-microsoft-com:office:word" xmlns:w="http://schemas.openxmlformats.org/wordprocessingml/2006/main" xmlns:w14="http://schemas.microsoft.com/office/word/2010/wordml" xmlns:w15="http://schemas.microsoft.com/office/word/2012/wordml" xmlns:w16cex="http://schemas.microsoft.com/office/word/2018/wordml/cex" xmlns:w16cid="http://schemas.microsoft.com/office/word/2016/wordml/cid" xmlns:w16="http://schemas.microsoft.com/office/word/2018/wordml" xmlns:w16du="http://schemas.microsoft.com/office/word/2023/wordml/word16du" xmlns:w16sdtdh="http://schemas.microsoft.com/office/word/2020/wordml/sdtdatahash" xmlns:w16sdtfl="http://schemas.microsoft.com/office/word/2024/wordml/sdtformatlock" xmlns:w16se="http://schemas.microsoft.com/office/word/2015/wordml/symex" xmlns:wpg="http://schemas.microsoft.com/office/word/2010/wordprocessingGroup" xmlns:wpi="http://schemas.microsoft.com/office/word/2010/wordprocessingInk" xmlns:wne="http://schemas.microsoft.com/office/word/2006/wordml" xmlns:wps="http://schemas.microsoft.com/office/word/2010/wordprocessingShape" mc:Ignorable="w14 w15 w16se w16cid w16 w16cex w16sdtdh w16sdtfl w16du wp14">
   <w:body>
     <w:p>
       <w:pPr>
@@ -261,6 +261,18 @@
       <w:pPr>
         <w:pStyle w:val="ListParagraph"/>
         <w:numPr>
+          <w:ilvl w:val="1"/>
+          <w:numId w:val="2"/>
+        </w:numPr>
+      </w:pPr>
+      <w:r>
+        <w:t>Unable to be updated unless Fraser gage comes back online</w:t>
+      </w:r>
+    </w:p>
+    <w:p>
+      <w:pPr>
+        <w:pStyle w:val="ListParagraph"/>
+        <w:numPr>
           <w:ilvl w:val="0"/>
           <w:numId w:val="2"/>
         </w:numPr>
@@ -327,6 +339,7 @@
       </w:pPr>
       <w:proofErr w:type="spellStart"/>
       <w:r>
+        <w:lastRenderedPageBreak/>
         <w:t>WindyGapPumpingRecord</w:t>
       </w:r>
       <w:proofErr w:type="spellEnd"/>
@@ -340,7 +353,6 @@
         </w:numPr>
       </w:pPr>
       <w:r>
-        <w:lastRenderedPageBreak/>
         <w:t xml:space="preserve">Exported CSV from </w:t>
       </w:r>
       <w:hyperlink r:id="rId7" w:history="1">
@@ -348,19 +360,19 @@
           <w:rPr>
             <w:rStyle w:val="Hyperlink"/>
           </w:rPr>
-          <w:t>http</w:t>
+          <w:t>https://dwr.state.co.us/Too</w:t>
         </w:r>
         <w:r>
           <w:rPr>
             <w:rStyle w:val="Hyperlink"/>
           </w:rPr>
-          <w:t>s</w:t>
+          <w:t>l</w:t>
         </w:r>
         <w:r>
           <w:rPr>
             <w:rStyle w:val="Hyperlink"/>
           </w:rPr>
-          <w:t>://dwr.state.co.us/Tools/Stations/WGPPMPCO</w:t>
+          <w:t>s/Stations/WGPPMPCO</w:t>
         </w:r>
       </w:hyperlink>
     </w:p>
@@ -493,6 +505,46 @@
       </w:r>
       <w:r>
         <w:t>)</w:t>
+      </w:r>
+    </w:p>
+    <w:p>
+      <w:r>
+        <w:rPr>
+          <w:color w:val="FF0000"/>
+        </w:rPr>
+        <w:t xml:space="preserve">Important: Even when new data is </w:t>
+      </w:r>
+      <w:proofErr w:type="gramStart"/>
+      <w:r>
+        <w:rPr>
+          <w:color w:val="FF0000"/>
+        </w:rPr>
+        <w:t>ran</w:t>
+      </w:r>
+      <w:proofErr w:type="gramEnd"/>
+      <w:r>
+        <w:rPr>
+          <w:color w:val="FF0000"/>
+        </w:rPr>
+        <w:t>, the old data can change because of revisions from USGS since each time the script is run it gets data from the whole study period.</w:t>
+      </w:r>
+      <w:r>
+        <w:rPr>
+          <w:color w:val="FF0000"/>
+        </w:rPr>
+        <w:t xml:space="preserve"> This influences the corrective factor used to assume the Upper Colorado flow above willow creek, which in turn </w:t>
+      </w:r>
+      <w:r>
+        <w:rPr>
+          <w:color w:val="FF0000"/>
+        </w:rPr>
+        <w:t>influences</w:t>
+      </w:r>
+      <w:r>
+        <w:rPr>
+          <w:color w:val="FF0000"/>
+        </w:rPr>
+        <w:t xml:space="preserve"> the assumed Fraser Flow</w:t>
       </w:r>
     </w:p>
     <w:p>
@@ -562,7 +614,15 @@
       </w:r>
       <w:proofErr w:type="spellEnd"/>
       <w:r>
-        <w:t>: contains all input data and various calculations used to recreate the hydrology. Basically a workbook</w:t>
+        <w:t xml:space="preserve">: contains all input data and various calculations used to recreate the hydrology. </w:t>
+      </w:r>
+      <w:proofErr w:type="gramStart"/>
+      <w:r>
+        <w:t>Basically</w:t>
+      </w:r>
+      <w:proofErr w:type="gramEnd"/>
+      <w:r>
+        <w:t xml:space="preserve"> a workbook</w:t>
       </w:r>
     </w:p>
     <w:p>
@@ -574,27 +634,32 @@
       </w:r>
     </w:p>
     <w:p>
+      <w:r>
+        <w:t>Once csv inputs are manually updated (check each to make sure column names are the same as the old files), run each bit of code one by one (</w:t>
+      </w:r>
+      <w:proofErr w:type="spellStart"/>
+      <w:r>
+        <w:t>cntrl+enter</w:t>
+      </w:r>
+      <w:proofErr w:type="spellEnd"/>
+      <w:r>
+        <w:t xml:space="preserve">) or run the whole script at once by clicking the “source” button. The script is well </w:t>
+      </w:r>
+      <w:proofErr w:type="gramStart"/>
+      <w:r>
+        <w:t>commented</w:t>
+      </w:r>
+      <w:proofErr w:type="gramEnd"/>
+      <w:r>
+        <w:t xml:space="preserve"> and you should be able to follow along. Generally, the flow of the script is as follows:</w:t>
+      </w:r>
+    </w:p>
+    <w:p>
       <w:pPr>
         <w:pStyle w:val="Heading3"/>
       </w:pPr>
       <w:r>
         <w:t>Setup</w:t>
-      </w:r>
-    </w:p>
-    <w:p>
-      <w:r>
-        <w:t>Once csv inputs are manually updated (check each to make sure column names are the same as the old files), run each bit of code one by one (</w:t>
-      </w:r>
-      <w:proofErr w:type="spellStart"/>
-      <w:r>
-        <w:t>cntrl+enter</w:t>
-      </w:r>
-      <w:proofErr w:type="spellEnd"/>
-      <w:r>
-        <w:t xml:space="preserve">) </w:t>
-      </w:r>
-      <w:r>
-        <w:t>or run the whole script at once by clicking the “source” button. The script is well commented and you should be able to follow along. Generally, the flow of the script is as follows:</w:t>
       </w:r>
     </w:p>
     <w:p>
@@ -636,10 +701,7 @@
         <w:t>() is defined</w:t>
       </w:r>
       <w:r>
-        <w:t xml:space="preserve"> and applied to </w:t>
-      </w:r>
-      <w:r>
-        <w:t>USGS gages outlined above</w:t>
+        <w:t xml:space="preserve"> and applied to USGS gages outlined above</w:t>
       </w:r>
       <w:r>
         <w:t xml:space="preserve"> </w:t>
@@ -686,7 +748,11 @@
         </w:numPr>
       </w:pPr>
       <w:r>
-        <w:t xml:space="preserve">Difference (by percent and total) between “Near Granby” USGS gage and “Below Lake Granby” gage is calculated. The percentage change is later used as a correction to the “Near Granby” gage to help assume flow when the “Near Granby” gage isn’t on but the “Below Lake Granby“ gage is </w:t>
+        <w:t xml:space="preserve">Difference (by percent and total) between “Near Granby” USGS gage and “Below Lake Granby” gage is calculated. The percentage change is later used as a correction to the “Near Granby” </w:t>
+      </w:r>
+      <w:r>
+        <w:lastRenderedPageBreak/>
+        <w:t xml:space="preserve">gage to help assume flow when the “Near Granby” gage isn’t on but the “Below Lake Granby“ gage is </w:t>
       </w:r>
     </w:p>
     <w:p>
@@ -762,23 +828,13 @@
         </w:numPr>
       </w:pPr>
       <w:r>
-        <w:lastRenderedPageBreak/>
-        <w:t xml:space="preserve">If data isn’t available for neither </w:t>
-      </w:r>
-      <w:r>
-        <w:t>“Near Granby” gage</w:t>
-      </w:r>
-      <w:r>
-        <w:t xml:space="preserve"> nor </w:t>
+        <w:t xml:space="preserve">If data isn’t available for neither “Near Granby” gage nor </w:t>
       </w:r>
       <w:r>
         <w:t>fall2025nearGranbyGageNWISInstant</w:t>
       </w:r>
       <w:r>
-        <w:t>.csv</w:t>
-      </w:r>
-      <w:r>
-        <w:t>, then apply the correction factor to “Below Lake Granby” gage to get assumed flow</w:t>
+        <w:t>.csv, then apply the correction factor to “Below Lake Granby” gage to get assumed flow</w:t>
       </w:r>
     </w:p>
     <w:p>
@@ -825,10 +881,7 @@
         <w:t xml:space="preserve"> Flow</w:t>
       </w:r>
       <w:r>
-        <w:t xml:space="preserve">” is calculated as </w:t>
-      </w:r>
-      <w:r>
-        <w:t>“</w:t>
+        <w:t>” is calculated as “</w:t>
       </w:r>
       <w:r>
         <w:t xml:space="preserve">Actual/Assumed </w:t>
@@ -939,30 +992,27 @@
       <w:r>
         <w:t>) and using ‘Assumed Fraser Flow’ if not</w:t>
       </w:r>
-      <w:bookmarkStart w:id="0" w:name="_GoBack"/>
-      <w:bookmarkEnd w:id="0"/>
     </w:p>
     <w:p>
       <w:pPr>
         <w:ind w:left="360"/>
       </w:pPr>
       <w:r>
-        <w:t>Metadata is added, ‘</w:t>
-      </w:r>
-      <w:r>
-        <w:t xml:space="preserve">CR </w:t>
+        <w:t xml:space="preserve">Metadata is </w:t>
       </w:r>
       <w:proofErr w:type="gramStart"/>
       <w:r>
-        <w:t>Below</w:t>
+        <w:t>added, ‘</w:t>
       </w:r>
       <w:proofErr w:type="gramEnd"/>
       <w:r>
-        <w:t xml:space="preserve"> WG Flow</w:t>
-      </w:r>
+        <w:t>CR Below WG Flow</w:t>
+      </w:r>
+      <w:proofErr w:type="gramStart"/>
       <w:r>
         <w:t>’, ‘</w:t>
       </w:r>
+      <w:proofErr w:type="gramEnd"/>
       <w:r>
         <w:t xml:space="preserve">Assumed/Actual </w:t>
       </w:r>
@@ -972,16 +1022,7 @@
       </w:r>
       <w:proofErr w:type="spellEnd"/>
       <w:r>
-        <w:t xml:space="preserve"> Flow</w:t>
-      </w:r>
-      <w:r>
-        <w:t>’, and ‘</w:t>
-      </w:r>
-      <w:r>
-        <w:t>Assumed/Actual Fraser Flow</w:t>
-      </w:r>
-      <w:r>
-        <w:t>’</w:t>
+        <w:t xml:space="preserve"> Flow’, and ‘Assumed/Actual Fraser Flow’</w:t>
       </w:r>
       <w:r>
         <w:t xml:space="preserve"> are selected for the </w:t>
@@ -1025,7 +1066,7 @@
 </file>
 
 <file path=word/numbering.xml><?xml version="1.0" encoding="utf-8"?>
-<w:numbering xmlns:wpc="http://schemas.microsoft.com/office/word/2010/wordprocessingCanvas" xmlns:cx="http://schemas.microsoft.com/office/drawing/2014/chartex" xmlns:cx1="http://schemas.microsoft.com/office/drawing/2015/9/8/chartex" xmlns:mc="http://schemas.openxmlformats.org/markup-compatibility/2006" xmlns:o="urn:schemas-microsoft-com:office:office" xmlns:r="http://schemas.openxmlformats.org/officeDocument/2006/relationships" xmlns:m="http://schemas.openxmlformats.org/officeDocument/2006/math" xmlns:v="urn:schemas-microsoft-com:vml" xmlns:wp14="http://schemas.microsoft.com/office/word/2010/wordprocessingDrawing" xmlns:wp="http://schemas.openxmlformats.org/drawingml/2006/wordprocessingDrawing" xmlns:w10="urn:schemas-microsoft-com:office:word" xmlns:w="http://schemas.openxmlformats.org/wordprocessingml/2006/main" xmlns:w14="http://schemas.microsoft.com/office/word/2010/wordml" xmlns:w15="http://schemas.microsoft.com/office/word/2012/wordml" xmlns:w16se="http://schemas.microsoft.com/office/word/2015/wordml/symex" xmlns:wpg="http://schemas.microsoft.com/office/word/2010/wordprocessingGroup" xmlns:wpi="http://schemas.microsoft.com/office/word/2010/wordprocessingInk" xmlns:wne="http://schemas.microsoft.com/office/word/2006/wordml" xmlns:wps="http://schemas.microsoft.com/office/word/2010/wordprocessingShape" mc:Ignorable="w14 w15 w16se wp14">
+<w:numbering xmlns:wpc="http://schemas.microsoft.com/office/word/2010/wordprocessingCanvas" xmlns:cx="http://schemas.microsoft.com/office/drawing/2014/chartex" xmlns:cx1="http://schemas.microsoft.com/office/drawing/2015/9/8/chartex" xmlns:cx2="http://schemas.microsoft.com/office/drawing/2015/10/21/chartex" xmlns:cx3="http://schemas.microsoft.com/office/drawing/2016/5/9/chartex" xmlns:cx4="http://schemas.microsoft.com/office/drawing/2016/5/10/chartex" xmlns:cx5="http://schemas.microsoft.com/office/drawing/2016/5/11/chartex" xmlns:cx6="http://schemas.microsoft.com/office/drawing/2016/5/12/chartex" xmlns:cx7="http://schemas.microsoft.com/office/drawing/2016/5/13/chartex" xmlns:cx8="http://schemas.microsoft.com/office/drawing/2016/5/14/chartex" xmlns:mc="http://schemas.openxmlformats.org/markup-compatibility/2006" xmlns:aink="http://schemas.microsoft.com/office/drawing/2016/ink" xmlns:am3d="http://schemas.microsoft.com/office/drawing/2017/model3d" xmlns:o="urn:schemas-microsoft-com:office:office" xmlns:oel="http://schemas.microsoft.com/office/2019/extlst" xmlns:r="http://schemas.openxmlformats.org/officeDocument/2006/relationships" xmlns:m="http://schemas.openxmlformats.org/officeDocument/2006/math" xmlns:v="urn:schemas-microsoft-com:vml" xmlns:wp14="http://schemas.microsoft.com/office/word/2010/wordprocessingDrawing" xmlns:wp="http://schemas.openxmlformats.org/drawingml/2006/wordprocessingDrawing" xmlns:w10="urn:schemas-microsoft-com:office:word" xmlns:w="http://schemas.openxmlformats.org/wordprocessingml/2006/main" xmlns:w14="http://schemas.microsoft.com/office/word/2010/wordml" xmlns:w15="http://schemas.microsoft.com/office/word/2012/wordml" xmlns:w16cex="http://schemas.microsoft.com/office/word/2018/wordml/cex" xmlns:w16cid="http://schemas.microsoft.com/office/word/2016/wordml/cid" xmlns:w16="http://schemas.microsoft.com/office/word/2018/wordml" xmlns:w16du="http://schemas.microsoft.com/office/word/2023/wordml/word16du" xmlns:w16sdtdh="http://schemas.microsoft.com/office/word/2020/wordml/sdtdatahash" xmlns:w16sdtfl="http://schemas.microsoft.com/office/word/2024/wordml/sdtformatlock" xmlns:w16se="http://schemas.microsoft.com/office/word/2015/wordml/symex" xmlns:wpg="http://schemas.microsoft.com/office/word/2010/wordprocessingGroup" xmlns:wpi="http://schemas.microsoft.com/office/word/2010/wordprocessingInk" xmlns:wne="http://schemas.microsoft.com/office/word/2006/wordml" xmlns:wps="http://schemas.microsoft.com/office/word/2010/wordprocessingShape" mc:Ignorable="w14 w15 w16se w16cid w16 w16cex w16sdtdh w16sdtfl w16du wp14">
   <w:abstractNum w:abstractNumId="0" w15:restartNumberingAfterBreak="0">
     <w:nsid w:val="2F7023CB"/>
     <w:multiLevelType w:val="hybridMultilevel"/>
@@ -1454,23 +1495,23 @@
       </w:rPr>
     </w:lvl>
   </w:abstractNum>
-  <w:num w:numId="1">
+  <w:num w:numId="1" w16cid:durableId="1925068393">
     <w:abstractNumId w:val="1"/>
   </w:num>
-  <w:num w:numId="2">
+  <w:num w:numId="2" w16cid:durableId="780955983">
     <w:abstractNumId w:val="3"/>
   </w:num>
-  <w:num w:numId="3">
+  <w:num w:numId="3" w16cid:durableId="439180282">
     <w:abstractNumId w:val="0"/>
   </w:num>
-  <w:num w:numId="4">
+  <w:num w:numId="4" w16cid:durableId="138309929">
     <w:abstractNumId w:val="2"/>
   </w:num>
 </w:numbering>
 </file>
 
 <file path=word/styles.xml><?xml version="1.0" encoding="utf-8"?>
-<w:styles xmlns:mc="http://schemas.openxmlformats.org/markup-compatibility/2006" xmlns:r="http://schemas.openxmlformats.org/officeDocument/2006/relationships" xmlns:w="http://schemas.openxmlformats.org/wordprocessingml/2006/main" xmlns:w14="http://schemas.microsoft.com/office/word/2010/wordml" xmlns:w15="http://schemas.microsoft.com/office/word/2012/wordml" xmlns:w16se="http://schemas.microsoft.com/office/word/2015/wordml/symex" mc:Ignorable="w14 w15 w16se">
+<w:styles xmlns:mc="http://schemas.openxmlformats.org/markup-compatibility/2006" xmlns:r="http://schemas.openxmlformats.org/officeDocument/2006/relationships" xmlns:w="http://schemas.openxmlformats.org/wordprocessingml/2006/main" xmlns:w14="http://schemas.microsoft.com/office/word/2010/wordml" xmlns:w15="http://schemas.microsoft.com/office/word/2012/wordml" xmlns:w16cex="http://schemas.microsoft.com/office/word/2018/wordml/cex" xmlns:w16cid="http://schemas.microsoft.com/office/word/2016/wordml/cid" xmlns:w16="http://schemas.microsoft.com/office/word/2018/wordml" xmlns:w16du="http://schemas.microsoft.com/office/word/2023/wordml/word16du" xmlns:w16sdtdh="http://schemas.microsoft.com/office/word/2020/wordml/sdtdatahash" xmlns:w16sdtfl="http://schemas.microsoft.com/office/word/2024/wordml/sdtformatlock" xmlns:w16se="http://schemas.microsoft.com/office/word/2015/wordml/symex" mc:Ignorable="w14 w15 w16se w16cid w16 w16cex w16sdtdh w16sdtfl w16du">
   <w:docDefaults>
     <w:rPrDefault>
       <w:rPr>
@@ -1486,7 +1527,7 @@
       </w:pPr>
     </w:pPrDefault>
   </w:docDefaults>
-  <w:latentStyles w:defLockedState="0" w:defUIPriority="99" w:defSemiHidden="0" w:defUnhideWhenUsed="0" w:defQFormat="0" w:count="371">
+  <w:latentStyles w:defLockedState="0" w:defUIPriority="99" w:defSemiHidden="0" w:defUnhideWhenUsed="0" w:defQFormat="0" w:count="376">
     <w:lsdException w:name="Normal" w:uiPriority="0" w:qFormat="1"/>
     <w:lsdException w:name="heading 1" w:uiPriority="9" w:qFormat="1"/>
     <w:lsdException w:name="heading 2" w:semiHidden="1" w:uiPriority="9" w:unhideWhenUsed="1" w:qFormat="1"/>
@@ -1858,6 +1899,11 @@
     <w:lsdException w:name="List Table 5 Dark Accent 6" w:uiPriority="50"/>
     <w:lsdException w:name="List Table 6 Colorful Accent 6" w:uiPriority="51"/>
     <w:lsdException w:name="List Table 7 Colorful Accent 6" w:uiPriority="52"/>
+    <w:lsdException w:name="Mention" w:semiHidden="1" w:unhideWhenUsed="1"/>
+    <w:lsdException w:name="Smart Hyperlink" w:semiHidden="1" w:unhideWhenUsed="1"/>
+    <w:lsdException w:name="Hashtag" w:semiHidden="1" w:unhideWhenUsed="1"/>
+    <w:lsdException w:name="Unresolved Mention" w:semiHidden="1" w:unhideWhenUsed="1"/>
+    <w:lsdException w:name="Smart Link" w:semiHidden="1" w:unhideWhenUsed="1"/>
   </w:latentStyles>
   <w:style w:type="paragraph" w:default="1" w:styleId="Normal">
     <w:name w:val="Normal"/>

</xml_diff>